<commit_message>
Ch11 round 2: Daren's logistics traceable; Gerald epigraph; castling; trims
Co-Authored-By: Claude Opus 5.5 <noreply@anthropic.com>
</commit_message>
<xml_diff>
--- a/claude-notes/manuscript-v2/11-then-the-board-merged.docx
+++ b/claude-notes/manuscript-v2/11-then-the-board-merged.docx
@@ -23,7 +23,7 @@
           <w:strike w:val="0"/>
           <w:color w:val="5C6B7D"/>
         </w:rPr>
-        <w:t>Otto listened without interrupting. When she finished, he sat still for a long time. Then he said: “Master Chan did something close to this once. His hand locked up after he overworked it — weeks of cramping, fingers that wouldn’t open even when he willed them. He didn’t try to force it. He sat cross-legged every morning and opened the hand in his mind — slowly, fully, every finger uncurling, an hour at a time. After a month the hand started answering him again. I never understood why it worked. But what you just described — the brain needing feedback to break the loop — that’s the same principle. You give the brain a mirror; Chan gave it attention.”</w:t>
+        <w:t>"You're a big boy, Gage. The faster a structure moves, the easier it is to tip."</w:t>
       </w:r>
     </w:p>
     <w:p>
@@ -34,7 +34,7 @@
           <w:strike w:val="0"/>
           <w:color w:val="5C6B7D"/>
         </w:rPr>
-        <w:t>— Book 1, Chapter 17: Mirror Mirror in the Box</w:t>
+        <w:t>— Book 1, Chapter 9: Badge 732</w:t>
       </w:r>
     </w:p>
     <w:p>
@@ -113,7 +113,7 @@
           <w:i w:val="0"/>
           <w:strike w:val="0"/>
         </w:rPr>
-        <w:t>He lay looking at the last line until the display dimmed to save power.</w:t>
+        <w:t>He lay looking at the last line until the display dimmed to save power. The summons released him from EVENT for the whole of intake morning.</w:t>
       </w:r>
     </w:p>
     <w:p>
@@ -432,7 +432,17 @@
           <w:i w:val="0"/>
           <w:strike w:val="0"/>
         </w:rPr>
-        <w:t>Ravi brought his horse out instead, and below, the black horse crossed the squares with its mane braided in ink-green thread. Two of his pieces now pressed on the white center.</w:t>
+        <w:t>Ravi brought his horse out instead, and below, the black horse crossed the squares with its mane braided in ink-green thread. Two of his pieces now pressed on the white center. He castled, and the black king's horseman and the near elephant traded squares at a walk.</w:t>
+      </w:r>
+    </w:p>
+    <w:p>
+      <w:r>
+        <w:rPr>
+          <w:b w:val="0"/>
+          <w:i w:val="0"/>
+          <w:strike w:val="0"/>
+        </w:rPr>
+        <w:t>"Black castles," the announcer called.</w:t>
       </w:r>
     </w:p>
     <w:p>
@@ -502,7 +512,7 @@
           <w:i w:val="0"/>
           <w:strike w:val="0"/>
         </w:rPr>
-        <w:t>Ravi pushed the camel deeper. "Black camel to king's rook five," the announcer called. "Check threat declared." The students near the back made a low sound. Several elders stopped writing.</w:t>
+        <w:t>Ravi pushed the camel deeper. "Black camel to king's rook five," the announcer called. The students near the back made a low sound. Several elders stopped writing.</w:t>
       </w:r>
     </w:p>
     <w:p>
@@ -623,7 +633,7 @@
           <w:i w:val="0"/>
           <w:strike w:val="0"/>
         </w:rPr>
-        <w:t>The Grandmaster folded his hands. "A player may win the first argument. The board decides whether the argument mattered."</w:t>
+        <w:t>The Grandmaster folded his hands. "You won the center. I let you."</w:t>
       </w:r>
     </w:p>
     <w:p>
@@ -813,17 +823,7 @@
           <w:i w:val="0"/>
           <w:strike w:val="0"/>
         </w:rPr>
-        <w:t>Ravi had walked this hall a hundred times as a student and stopped at the famine, because the famine was the one they tested. Today he slowed at the last panel. His legs had begun to shake under the coat, late, the run and the board arriving together, and he stood until they stopped. The board didn't always end when the strongest move was made. Sometimes it ended when one side decided how the move would be remembered, and someone had just decided that for him.</w:t>
-      </w:r>
-    </w:p>
-    <w:p>
-      <w:r>
-        <w:rPr>
-          <w:b w:val="0"/>
-          <w:i w:val="0"/>
-          <w:strike w:val="0"/>
-        </w:rPr>
-        <w:t>Past the Hall, in the narrow Corridor of Unsaid Things, an instructor stood with two apprentices before a black glass case holding one blank sheet of paper, teaching them to read it as a decision someone had made.</w:t>
+        <w:t>Ravi had walked this hall a hundred times as a student and stopped at the famine, because the famine was the one they tested. Today he slowed at the last panel. His legs had begun to shake under the coat, late, the run and the board arriving together, and he stood until they stopped. Someone had decided how this game would be remembered. It hadn't been him.</w:t>
       </w:r>
     </w:p>
     <w:p>
@@ -903,7 +903,7 @@
           <w:i w:val="0"/>
           <w:strike w:val="0"/>
         </w:rPr>
-        <w:t>He knew it at once: dark stone, a pale seam through the base, one shoulder of the crown worn smooth. Twenty minutes ago it had been on the Grandmaster's table, trapped. Beside it lay a small printed card.</w:t>
+        <w:t>He knew it at once: dark stone, a pale seam through the base, one shoulder of the crown worn smooth. Half an hour ago it had been on the Grandmaster's table, trapped. Beside it lay a small printed card.</w:t>
       </w:r>
     </w:p>
     <w:p>
@@ -933,7 +933,7 @@
           <w:i w:val="0"/>
           <w:strike w:val="0"/>
         </w:rPr>
-        <w:t>The Grandmaster could have sent them. That was the easiest explanation and so the least trustworthy. A man who meant to spare him wouldn't have built the cage so completely, or released the queen only after the alert came. There were older players in the ten, sharper ones. Nobody had a reason to protect Ravi from a full defeat.</w:t>
+        <w:t>The Grandmaster could have sent them. That was the easiest explanation. He set it aside. A man who meant to spare him wouldn't have built the cage so completely, or released the queen only after the alert came. There were older players in the ten, sharper ones. Nobody had a reason to protect Ravi from a full defeat.</w:t>
       </w:r>
     </w:p>
     <w:p>
@@ -963,7 +963,7 @@
           <w:i w:val="0"/>
           <w:strike w:val="0"/>
         </w:rPr>
-        <w:t>He picked up the king and closed his hand around it. The stone was warmer than the room.</w:t>
+        <w:t>He picked up the king and the card, and closed his hand around the king. The stone was warmer than the room.</w:t>
       </w:r>
     </w:p>
     <w:p>
@@ -973,7 +973,7 @@
           <w:i w:val="0"/>
           <w:strike w:val="0"/>
         </w:rPr>
-        <w:t>He sat on the narrow bed without undressing and let his mind work. Access path. Motive. Board state. Each answer split into three, and every branch bent back to the same fact: someone had stopped a checkmate before it became a loss and wanted him to know it. The window went from grey to the color of the walls, and then darker than the walls. The card slid off his knee onto the blanket. He didn't notice. Eventually the arguments stopped standing up, and he lay back with the king in his fist and slept.</w:t>
+        <w:t>He sat on the narrow bed without undressing and let his mind work. Access path. Motive. Board state. Each answer split into three, and every branch bent back to the same fact: someone had stopped a checkmate before it became a loss and wanted him to know it. The window went from the color of the walls to darker than the walls, and the wing outside his door went quiet. No call came to return him to his console. The card slid off his knee onto the blanket. He didn't notice. Eventually the arguments stopped standing up, and he lay back with the king in his fist and slept.</w:t>
       </w:r>
     </w:p>
     <w:p>
@@ -983,7 +983,17 @@
           <w:i w:val="0"/>
           <w:strike w:val="0"/>
         </w:rPr>
-        <w:t>The storage recess had smelled of laundry starch and stacked spare coats, and a hanger's hook had been pressing between Daren's shoulder blades since midday. He waited a minute after Ravi's breathing went long. Then he opened the recess from the inside and stepped out without a sound.</w:t>
+        <w:t>Daren had set the king down with minutes to spare.</w:t>
+      </w:r>
+    </w:p>
+    <w:p>
+      <w:r>
+        <w:rPr>
+          <w:b w:val="0"/>
+          <w:i w:val="0"/>
+          <w:strike w:val="0"/>
+        </w:rPr>
+        <w:t>The storage recess smelled of laundry starch and stacked spare coats, and a hanger's hook had been pressing between his shoulder blades since the match ended. The first part had been the band: one narrow line sent from the arena gallery into the Grandmaster's private display, on a path that would wear someone else's name if anyone ever walked it back. The second part had been hands. While the elders rose and the tiers broke into whispers, the black king had left the guarded table inside his glove, and it had been standing on the writing surface before Ravi finished the Hall. Then the recess, and the long afternoon, and the dark. He waited a minute after Ravi's breathing went long. Then he opened the recess from the inside and stepped out without a sound.</w:t>
       </w:r>
     </w:p>
     <w:p>
@@ -1003,7 +1013,7 @@
           <w:i w:val="0"/>
           <w:strike w:val="0"/>
         </w:rPr>
-        <w:t>The card lay on the edge of the blanket. Daren lifted it between two fingers and slid it into the inner seam of his right glove, where the mesh met the cuff just short of the band. In its place, beside Ravi's open hand, he set the other card.</w:t>
+        <w:t>The card lay on the edge of the blanket. Daren lifted it between two fingers and slid it into the inner seam of his right glove, where the mesh met the cuff just short of the band. The first card had only said he was welcome. The second was the invitation, and it was for the morning, when Ravi woke and understood that someone had stood over him while he slept. In its place, beside Ravi's open hand, he set the other card.</w:t>
       </w:r>
     </w:p>
     <w:p>
@@ -1043,6 +1053,16 @@
           <w:i w:val="0"/>
           <w:strike w:val="0"/>
         </w:rPr>
+        <w:t>He would have the whole day to decide whether to come.</w:t>
+      </w:r>
+    </w:p>
+    <w:p>
+      <w:r>
+        <w:rPr>
+          <w:b w:val="0"/>
+          <w:i w:val="0"/>
+          <w:strike w:val="0"/>
+        </w:rPr>
         <w:t>The window above the writing surface held Chanakya's slice of sky. He found it without looking for it: the patch of dark between the stars, the lights around it bent into tight wrong arcs, one dropping out of sight at the edge and coming back above. The mass at the center showed itself only in what it moved.</w:t>
       </w:r>
     </w:p>
@@ -1063,7 +1083,7 @@
           <w:i w:val="0"/>
           <w:strike w:val="0"/>
         </w:rPr>
-        <w:t>The residential corridor was green-gray and busy with the evening rotation, representatives walking to analysis rooms with panes under their arms. As Daren came within range a wrist terminal flickered on a clerk's left arm. A wall sensor dimmed. A route marker on the floor slid a hand's width to the side, and a woman stepped with it without looking down. Nobody stopped him. Eyes went to tablets, cuffs, floor grids, anywhere but the dark figure moving among them. These were people trained since childhood to notice what others missed, and they parted around him the way water parts around a stone it has decided isn't there.</w:t>
+        <w:t>The residential corridor was green-gray and thin with the night rotation, representatives walking to analysis rooms with panes under their arms. As Daren came within range a wrist terminal flickered on a clerk's left arm. A wall sensor dimmed. A route marker on the floor slid a hand's width to the side, and a woman stepped with it without looking down. Nobody stopped him. These were people trained since childhood to notice what others missed, and they parted around him, eyes on cuffs and tablets, each certain the gap was their own idea.</w:t>
       </w:r>
     </w:p>
     <w:p>
@@ -1073,7 +1093,7 @@
           <w:i w:val="0"/>
           <w:strike w:val="0"/>
         </w:rPr>
-        <w:t>Drona first, the old man had said. Nobody had said Chanakya last.</w:t>
+        <w:t>Drona first, the Master had said. Nobody had said Chanakya last.</w:t>
       </w:r>
     </w:p>
     <w:p>

</xml_diff>

<commit_message>
Ch11 round 3: heist runs on systems; Ravi sweeps the room; legal king move; trims
Co-Authored-By: Claude Opus 5.5 <noreply@anthropic.com>
</commit_message>
<xml_diff>
--- a/claude-notes/manuscript-v2/11-then-the-board-merged.docx
+++ b/claude-notes/manuscript-v2/11-then-the-board-merged.docx
@@ -262,7 +262,7 @@
           <w:i w:val="0"/>
           <w:strike w:val="0"/>
         </w:rPr>
-        <w:t>The final tone sounded and the runners slowed as one body. Sweat was permitted. Display was not. Ravi took water, dried his face, and followed the escort waiting at the doors.</w:t>
+        <w:t>The final tone sounded and the runners slowed as one body. Ravi took water, dried his face, and followed the escort waiting at the doors.</w:t>
       </w:r>
     </w:p>
     <w:p>
@@ -569,17 +569,6 @@
       <w:r>
         <w:rPr>
           <w:b w:val="0"/>
-          <w:i/>
-          <w:strike w:val="0"/>
-          <w:color w:val="5C6B7D"/>
-        </w:rPr>
-        <w:t>He had been so sure. He was always so sure.</w:t>
-      </w:r>
-    </w:p>
-    <w:p>
-      <w:r>
-        <w:rPr>
-          <w:b w:val="0"/>
           <w:i w:val="0"/>
           <w:strike w:val="0"/>
         </w:rPr>
@@ -603,7 +592,7 @@
           <w:i w:val="0"/>
           <w:strike w:val="0"/>
         </w:rPr>
-        <w:t>The queen took him. The white mare crossed into the black line like a blade drawn slowly enough for everyone to see it.</w:t>
+        <w:t>The queen took him. The white mare crossed into the black line, slowly enough for everyone to see it.</w:t>
       </w:r>
     </w:p>
     <w:p>
@@ -663,7 +652,7 @@
           <w:i w:val="0"/>
           <w:strike w:val="0"/>
         </w:rPr>
-        <w:t>"Black king to rook two," the announcer called, and the horseman backed his mount with the stiff dignity of a ruler retreating in front of witnesses.</w:t>
+        <w:t>"Black king to rook one," the announcer called, and the horseman walked his mount one square into the corner and sat straight in the saddle.</w:t>
       </w:r>
     </w:p>
     <w:p>
@@ -673,7 +662,7 @@
           <w:i w:val="0"/>
           <w:strike w:val="0"/>
         </w:rPr>
-        <w:t>The Grandmaster's fingers closed over the white queen. Ravi saw the square before it moved: the open file, the elephant sealing the line behind her, the two footmen finishing it. Mate in one. He drew his hand back from the board to concede.</w:t>
+        <w:t>The Grandmaster's fingers closed over the white queen. Ravi saw the square before it moved: the open file, the elephant sealing the line behind her, the two footmen finishing it. Mate in one. He began to draw his hand back from the board to concede.</w:t>
       </w:r>
     </w:p>
     <w:p>
@@ -753,7 +742,7 @@
           <w:i w:val="0"/>
           <w:strike w:val="0"/>
         </w:rPr>
-        <w:t>He left the table. Below the rail the living board stayed frozen, the white queen's mare stamping under her rider's gloved hand, the black king's horseman staring across the floor at the square that would have ended him. Around the enclosure the elders began to whisper. Nobody had ever beaten the Grandmaster. Nobody had ever been given a draw by interruption either, and in the records, when they were written, there would be no loss beside Ravi's name. He was too disciplined to smile in the corridor, and too honest with himself to pretend he didn't want to.</w:t>
+        <w:t>He left the table. Below the rail the living board stayed frozen, the white queen's mare stamping under her rider's gloved hand, the black king's horseman staring across the floor at the square that would have ended him. Around the enclosure the elders began to whisper. Nobody had ever beaten the Grandmaster. Nobody had ever been given a draw by interruption either, and in the records, when they were written, there would be no loss beside Ravi's name. In the corridor he kept his face still. His hands were another matter, so he put them in his sleeves.</w:t>
       </w:r>
     </w:p>
     <w:p>
@@ -953,7 +942,7 @@
           <w:i w:val="0"/>
           <w:strike w:val="0"/>
         </w:rPr>
-        <w:t>Someone had known the board. Someone had known the Grandmaster was one move from mate and had reached far enough into Chanakya to interrupt him, then lifted the king off a guarded table, carried it through the wing, and set it in this room before Ravi's feet had finished the walk. The card said the interruption had been done for him. It didn't say why, which meant he was supposed to come and ask.</w:t>
+        <w:t>Someone had known the board. Someone had known the Grandmaster was one move from mate and had reached far enough into Chanakya to interrupt him, then got the king off a guarded table and into this room before Ravi's feet had finished the walk. The card said the interruption had been done for him. It didn't say why, which meant he was supposed to come and ask.</w:t>
       </w:r>
     </w:p>
     <w:p>
@@ -973,7 +962,7 @@
           <w:i w:val="0"/>
           <w:strike w:val="0"/>
         </w:rPr>
-        <w:t>He sat on the narrow bed without undressing and let his mind work. Access path. Motive. Board state. Each answer split into three, and every branch bent back to the same fact: someone had stopped a checkmate before it became a loss and wanted him to know it. The window went from the color of the walls to darker than the walls, and the wing outside his door went quiet. No call came to return him to his console. The card slid off his knee onto the blanket. He didn't notice. Eventually the arguments stopped standing up, and he lay back with the king in his fist and slept.</w:t>
+        <w:t>He sat on the narrow bed without undressing and let his mind work. Access path. Motive. Board state. Each answer split into three, and every branch bent back to the same fact: someone had stopped a checkmate before it became a loss and wanted him to know it. The window went from the color of the walls to darker than the walls, and the wing outside his door went quiet. No call came to return him to his console. He got up and checked the room: the recess panel, the door log, the window seal. Clean. Near midnight he lay back with the king in his fist. Whoever came for it would have to come past him. He meant to be awake for that. The run and the board took him somewhere between one argument and the next; the card slid off his knee onto the blanket, and he slept.</w:t>
       </w:r>
     </w:p>
     <w:p>
@@ -993,7 +982,7 @@
           <w:i w:val="0"/>
           <w:strike w:val="0"/>
         </w:rPr>
-        <w:t>The storage recess smelled of laundry starch and stacked spare coats, and a hanger's hook had been pressing between his shoulder blades since the match ended. The first part had been the band: one narrow line sent from the arena gallery into the Grandmaster's private display, on a path that would wear someone else's name if anyone ever walked it back. The second part had been hands. While the elders rose and the tiers broke into whispers, the black king had left the guarded table inside his glove, and it had been standing on the writing surface before Ravi finished the Hall. Then the recess, and the long afternoon, and the dark. He waited a minute after Ravi's breathing went long. Then he opened the recess from the inside and stepped out without a sound.</w:t>
+        <w:t>The storage recess smelled of laundry starch and stacked spare coats, and a hanger's hook had been pressing between his shoulder blades since the match ended. The interrupt had been one narrow line sent from the arena gallery through the band into the Grandmaster's private display, on a path that would wear someone else's name if anyone ever walked it back. The black king had gone into its case with the others, and the case had gone down a service lift that, for ninety seconds, stopped at the wrong floor, where Daren was waiting. Ravi's check of the room had found what it was allowed to find: the recess had read as a sealed maintenance panel all afternoon, and the door log had shown nothing because nothing had been allowed to show. Daren waited a minute after Ravi's breathing went long. Then he opened the recess from the inside and stepped out without a sound.</w:t>
       </w:r>
     </w:p>
     <w:p>
@@ -1013,7 +1002,7 @@
           <w:i w:val="0"/>
           <w:strike w:val="0"/>
         </w:rPr>
-        <w:t>The card lay on the edge of the blanket. Daren lifted it between two fingers and slid it into the inner seam of his right glove, where the mesh met the cuff just short of the band. The first card had only said he was welcome. The second was the invitation, and it was for the morning, when Ravi woke and understood that someone had stood over him while he slept. In its place, beside Ravi's open hand, he set the other card.</w:t>
+        <w:t>The card lay on the edge of the blanket. Daren lifted it between two fingers and slid it into the inner seam of his right glove, where the mesh met the cuff just short of the band. The first card had only said he was welcome. The second was the invitation. He wanted Ravi to read it in the morning, with the first card gone, and understand that someone had stood over him while he slept. In its place, beside Ravi's open hand, he set the second.</w:t>
       </w:r>
     </w:p>
     <w:p>
@@ -1083,7 +1072,7 @@
           <w:i w:val="0"/>
           <w:strike w:val="0"/>
         </w:rPr>
-        <w:t>The residential corridor was green-gray and thin with the night rotation, representatives walking to analysis rooms with panes under their arms. As Daren came within range a wrist terminal flickered on a clerk's left arm. A wall sensor dimmed. A route marker on the floor slid a hand's width to the side, and a woman stepped with it without looking down. Nobody stopped him. These were people trained since childhood to notice what others missed, and they parted around him, eyes on cuffs and tablets, each certain the gap was their own idea.</w:t>
+        <w:t>The residential corridor was green-gray and thin with the night rotation, representatives walking to analysis rooms with panes under their arms. As Daren came within range a wrist terminal flickered on a clerk's left arm. A wall sensor dimmed. A route marker on the floor slid aside, and a woman stepped with it without looking down. Nobody stopped him. These were people trained since childhood to notice what others missed, and they parted around him, each following a floor marker that had moved a hand's width for him.</w:t>
       </w:r>
     </w:p>
     <w:p>
@@ -1093,7 +1082,7 @@
           <w:i w:val="0"/>
           <w:strike w:val="0"/>
         </w:rPr>
-        <w:t>Drona first, the Master had said. Nobody had said Chanakya last.</w:t>
+        <w:t>Drona first, the old man, the Master of the Reserve, had said. Nobody had said Chanakya last.</w:t>
       </w:r>
     </w:p>
     <w:p>

</xml_diff>

<commit_message>
Ch11 round 4: no recess; Daren returns through the door; Ravi reads the alert timing
Co-Authored-By: Claude Opus 5.5 <noreply@anthropic.com>
</commit_message>
<xml_diff>
--- a/claude-notes/manuscript-v2/11-then-the-board-merged.docx
+++ b/claude-notes/manuscript-v2/11-then-the-board-merged.docx
@@ -302,7 +302,7 @@
           <w:i w:val="0"/>
           <w:strike w:val="0"/>
         </w:rPr>
-        <w:t>Within the house he was the Arthashastri, master of the old science of statecraft that had given the gana its name. Ravi stood and bowed with one hand over his heart. The Grandmaster answered with a slight inclination of the head, half acknowledgment and half assessment, and took the far chair.</w:t>
+        <w:t>The Grandmaster came through them alone. Within the house he was the Arthashastri, master of the old science of statecraft that had given the gana its name. Ravi stood and bowed with one hand over his heart. The Grandmaster answered with a slight inclination of the head, half acknowledgment and half assessment, and took the far chair.</w:t>
       </w:r>
     </w:p>
     <w:p>
@@ -922,7 +922,7 @@
           <w:i w:val="0"/>
           <w:strike w:val="0"/>
         </w:rPr>
-        <w:t>The Grandmaster could have sent them. That was the easiest explanation. He set it aside. A man who meant to spare him wouldn't have built the cage so completely, or released the queen only after the alert came. There were older players in the ten, sharper ones. Nobody had a reason to protect Ravi from a full defeat.</w:t>
+        <w:t>The Grandmaster could have sent them. That was the easiest explanation. He set it aside. A man who meant to spare him wouldn't have built the cage so completely, or let go of the queen only after the alert came. There were older players in the ten, sharper ones. Nobody had a reason to protect Ravi from a full defeat.</w:t>
       </w:r>
     </w:p>
     <w:p>
@@ -942,7 +942,7 @@
           <w:i w:val="0"/>
           <w:strike w:val="0"/>
         </w:rPr>
-        <w:t>Someone had known the board. Someone had known the Grandmaster was one move from mate and had reached far enough into Chanakya to interrupt him, then got the king off a guarded table and into this room before Ravi's feet had finished the walk. The card said the interruption had been done for him. It didn't say why, which meant he was supposed to come and ask.</w:t>
+        <w:t>Someone had known the board. Someone had known the Grandmaster was one move from mate and had reached far enough into Chanakya to interrupt him, then got the king off a guarded table and into this room before Ravi's feet had finished the walk. The card said only that he was welcome. It did not say who had stopped the mate, or why, which meant he was supposed to come and ask.</w:t>
       </w:r>
     </w:p>
     <w:p>
@@ -962,7 +962,7 @@
           <w:i w:val="0"/>
           <w:strike w:val="0"/>
         </w:rPr>
-        <w:t>He sat on the narrow bed without undressing and let his mind work. Access path. Motive. Board state. Each answer split into three, and every branch bent back to the same fact: someone had stopped a checkmate before it became a loss and wanted him to know it. The window went from the color of the walls to darker than the walls, and the wing outside his door went quiet. No call came to return him to his console. He got up and checked the room: the recess panel, the door log, the window seal. Clean. Near midnight he lay back with the king in his fist. Whoever came for it would have to come past him. He meant to be awake for that. The run and the board took him somewhere between one argument and the next; the card slid off his knee onto the blanket, and he slept.</w:t>
+        <w:t>He sat on the narrow bed without undressing and let his mind work. Access path. Motive. Board state. Each answer split into three, and every branch bent back to the same fact: someone had stopped a checkmate before it became a loss and wanted him to know it. The window went from the color of the walls to darker than the walls, and the wing outside his door went quiet. No call came to return him to his console. He rebuilt the final position on the writing surface and played the last moves through again. The alert had come one move before mate, to the move. Someone had been watching the board. He got up and checked the room: the recess panel, the door log, the window seal. Clean. Near midnight he lay back with the king in his fist. Whoever came for it would have to come past him. He meant to be awake for that. The run and the board took him somewhere between one argument and the next; the card slid off his knee onto the blanket, and he slept.</w:t>
       </w:r>
     </w:p>
     <w:p>
@@ -972,7 +972,7 @@
           <w:i w:val="0"/>
           <w:strike w:val="0"/>
         </w:rPr>
-        <w:t>Daren had set the king down with minutes to spare.</w:t>
+        <w:t>Daren had set the king down with minutes to spare, and gone.</w:t>
       </w:r>
     </w:p>
     <w:p>
@@ -982,7 +982,7 @@
           <w:i w:val="0"/>
           <w:strike w:val="0"/>
         </w:rPr>
-        <w:t>The storage recess smelled of laundry starch and stacked spare coats, and a hanger's hook had been pressing between his shoulder blades since the match ended. The interrupt had been one narrow line sent from the arena gallery through the band into the Grandmaster's private display, on a path that would wear someone else's name if anyone ever walked it back. The black king had gone into its case with the others, and the case had gone down a service lift that, for ninety seconds, stopped at the wrong floor, where Daren was waiting. Ravi's check of the room had found what it was allowed to find: the recess had read as a sealed maintenance panel all afternoon, and the door log had shown nothing because nothing had been allowed to show. Daren waited a minute after Ravi's breathing went long. Then he opened the recess from the inside and stepped out without a sound.</w:t>
+        <w:t>The interrupt had left the gallery under someone else's name. The king had come down a service lift that, for ninety seconds, stopped at the wrong floor.</w:t>
       </w:r>
     </w:p>
     <w:p>
@@ -992,7 +992,17 @@
           <w:i w:val="0"/>
           <w:strike w:val="0"/>
         </w:rPr>
-        <w:t>In the unlit room the ensemble was darker than the walls. The Chanakya boy lay on his back with the king still clenched, his mouth slightly open, a crease between his brows where the problem had followed him under. Daren had watched the footage of the Initiation get passed round this gana. They'd laughed loudest. Now one of their best had gone to sleep inside a question and failed to think his way out.</w:t>
+        <w:t>He came back after midnight. The door opened for him without a sound and wrote nothing in its log.</w:t>
+      </w:r>
+    </w:p>
+    <w:p>
+      <w:r>
+        <w:rPr>
+          <w:b w:val="0"/>
+          <w:i w:val="0"/>
+          <w:strike w:val="0"/>
+        </w:rPr>
+        <w:t>In the unlit room his black ensemble was darker than the walls. The Chanakya boy lay on his back with the king still clenched, his mouth slightly open, a crease between his brows where the problem had followed him under. Daren had watched the footage of the Initiation get passed round this gana. They'd laughed loudest. Now one of their best had gone to sleep inside a question.</w:t>
       </w:r>
     </w:p>
     <w:p>
@@ -1082,7 +1092,7 @@
           <w:i w:val="0"/>
           <w:strike w:val="0"/>
         </w:rPr>
-        <w:t>Drona first, the old man, the Master of the Reserve, had said. Nobody had said Chanakya last.</w:t>
+        <w:t>Drona first, Kubera's old man had said. Nobody had said Chanakya last.</w:t>
       </w:r>
     </w:p>
     <w:p>

</xml_diff>

<commit_message>
Ch11 final: eight footmen, coordinate-free queen calls, POV fix, closing line
Co-Authored-By: Claude Opus 5.5 <noreply@anthropic.com>
</commit_message>
<xml_diff>
--- a/claude-notes/manuscript-v2/11-then-the-board-merged.docx
+++ b/claude-notes/manuscript-v2/11-then-the-board-merged.docx
@@ -332,7 +332,7 @@
           <w:i w:val="0"/>
           <w:strike w:val="0"/>
         </w:rPr>
-        <w:t>Below the rail, the living board filled the arena floor: sixty-four pale and dark squares, each large enough to hold a rider. Sixteen footmen in white faced sixteen in black, short ceremonial spears upright. Behind them stood the elephants, real and immense, handlers in lacquered harness on their necks. Horses stamped at the flanks beside tall camels draped in geometric cloth. On each back rank an adorned horseman under a high crested helm stood for the king, and beside him a lady of honor sat a dark mare, robed in green and gold beneath a slender circlet, standing for the queen. A footman taken here would walk to the square where he was taken, stand in it, and be led off in front of everyone.</w:t>
+        <w:t>Below the rail, the living board filled the arena floor: sixty-four pale and dark squares, each large enough to hold a rider. Eight footmen in white faced eight in black, short ceremonial spears upright. Behind them stood the elephants, real and immense, handlers in lacquered harness on their necks. Horses stamped at the flanks beside tall camels draped in geometric cloth. On each back rank an adorned horseman under a high crested helm stood for the king, and beside him a lady of honor sat a dark mare, robed in green and gold beneath a slender circlet, standing for the queen. A footman taken here would walk to the square where he was taken, stand in it, and be led off in front of everyone.</w:t>
       </w:r>
     </w:p>
     <w:p>
@@ -562,7 +562,7 @@
           <w:i w:val="0"/>
           <w:strike w:val="0"/>
         </w:rPr>
-        <w:t>"White queen to king's knight four. Counter-threat."</w:t>
+        <w:t>"White queen. Counter-threat."</w:t>
       </w:r>
     </w:p>
     <w:p>
@@ -602,7 +602,7 @@
           <w:i w:val="0"/>
           <w:strike w:val="0"/>
         </w:rPr>
-        <w:t>"White queen takes king's knight pawn. Check."</w:t>
+        <w:t>"White queen takes. Check."</w:t>
       </w:r>
     </w:p>
     <w:p>
@@ -682,7 +682,7 @@
           <w:i w:val="0"/>
           <w:strike w:val="0"/>
         </w:rPr>
-        <w:t>Nothing sounded. Chanakya did not embarrass urgency by making it loud. A narrow line of text opened on the Grandmaster's private display, visible to no one else, and his face changed before it had finished writing itself. The gentleness went out of it. Behind Ravi the elders sat straighter without knowing why.</w:t>
+        <w:t>Nothing sounded. Chanakya did not embarrass urgency by making it loud. A narrow line of text opened on the Grandmaster's private display, visible to no one else, and his face changed before it had finished writing itself. The gentleness went out of it. Behind Ravi, chairs creaked as the elders sat straighter.</w:t>
       </w:r>
     </w:p>
     <w:p>
@@ -1092,7 +1092,7 @@
           <w:i w:val="0"/>
           <w:strike w:val="0"/>
         </w:rPr>
-        <w:t>Drona first, Kubera's old man had said. Nobody had said Chanakya last.</w:t>
+        <w:t>Drona first, Kubera's old man had said. He had never said what came after.</w:t>
       </w:r>
     </w:p>
     <w:p>

</xml_diff>